<commit_message>
Cite public M19 archive in submission documents
</commit_message>
<xml_diff>
--- a/submission_package/stage21_m19_scientific_reports_revision/cover_letter.docx
+++ b/submission_package/stage21_m19_scientific_reports_revision/cover_letter.docx
@@ -2,7 +2,7 @@
 <file path=word/document.xml><?xml version="1.0" encoding="utf-8"?>
 <w:document xmlns:w="http://schemas.openxmlformats.org/wordprocessingml/2006/main" xmlns:m="http://schemas.openxmlformats.org/officeDocument/2006/math" xmlns:r="http://schemas.openxmlformats.org/officeDocument/2006/relationships" xmlns:o="urn:schemas-microsoft-com:office:office" xmlns:v="urn:schemas-microsoft-com:vml" xmlns:w10="urn:schemas-microsoft-com:office:word" xmlns:a="http://schemas.openxmlformats.org/drawingml/2006/main" xmlns:pic="http://schemas.openxmlformats.org/drawingml/2006/picture" xmlns:wp="http://schemas.openxmlformats.org/drawingml/2006/wordprocessingDrawing">
   <w:body>
-    <w:bookmarkStart w:id="10" w:name="cover-letter"/>
+    <w:bookmarkStart w:id="11" w:name="cover-letter"/>
     <w:p>
       <w:pPr>
         <w:pStyle w:val="Heading1"/>
@@ -58,7 +58,21 @@
         <w:pStyle w:val="BodyText"/>
       </w:pPr>
       <w:r>
-        <w:t xml:space="preserve">The work is original and not under consideration elsewhere. The author declares no competing interests and no specific funding. Only public de-identified data were analyzed. Code, tables, search logs, and checksums accompany the submission. The historical public repository tag is identified accurately as predating M19; no unissued DOI is claimed.</w:t>
+        <w:t xml:space="preserve">The work is original and not under consideration elsewhere. The author declares no competing interests and no specific funding. Only public de-identified data were analyzed. Code, tables, search logs, and checksums accompany the submission and are publicly versioned at</w:t>
+      </w:r>
+      <w:r>
+        <w:t xml:space="preserve"> </w:t>
+      </w:r>
+      <w:hyperlink r:id="rId9">
+        <w:r>
+          <w:rPr>
+            <w:rStyle w:val="Hyperlink"/>
+          </w:rPr>
+          <w:t xml:space="preserve">https://github.com/denglizhen-113/dkd-focused-universe-reanalysis/tree/v1.1.1</w:t>
+        </w:r>
+      </w:hyperlink>
+      <w:r>
+        <w:t xml:space="preserve">. No DOI has been assigned.</w:t>
       </w:r>
     </w:p>
     <w:p>
@@ -91,7 +105,7 @@
       <w:r>
         <w:t xml:space="preserve"> </w:t>
       </w:r>
-      <w:hyperlink r:id="rId9">
+      <w:hyperlink r:id="rId10">
         <w:r>
           <w:rPr>
             <w:rStyle w:val="Hyperlink"/>
@@ -106,9 +120,9 @@
         <w:t xml:space="preserve">ORCID 0009-0003-2428-8176</w:t>
       </w:r>
     </w:p>
-    <w:bookmarkEnd w:id="10"/>
+    <w:bookmarkEnd w:id="11"/>
     <w:sectPr>
-      <w:footerReference w:type="default" r:id="rId10"/>
+      <w:footerReference w:type="default" r:id="rId11"/>
       <w:footnotePr>
         <w:numRestart w:val="eachSect"/>
       </w:footnotePr>

</xml_diff>